<commit_message>
inclusão da aula de 06/03
</commit_message>
<xml_diff>
--- a/professor.lincoln/computacionais-seguranca/Plano de Ensino - Sistemas computacionais e segurança.docx
+++ b/professor.lincoln/computacionais-seguranca/Plano de Ensino - Sistemas computacionais e segurança.docx
@@ -8954,14 +8954,18 @@
   <w:rsids>
     <w:rsidRoot w:val="00E041A2"/>
     <w:rsid w:val="001F042A"/>
+    <w:rsid w:val="002338D6"/>
     <w:rsid w:val="002F5359"/>
     <w:rsid w:val="0030125E"/>
     <w:rsid w:val="004A7215"/>
     <w:rsid w:val="00532A11"/>
+    <w:rsid w:val="00562D5C"/>
     <w:rsid w:val="00612ECC"/>
     <w:rsid w:val="00621533"/>
+    <w:rsid w:val="00641BB8"/>
     <w:rsid w:val="00743C3F"/>
     <w:rsid w:val="00800A8F"/>
+    <w:rsid w:val="00CF6E64"/>
     <w:rsid w:val="00D7524D"/>
     <w:rsid w:val="00E041A2"/>
     <w:rsid w:val="00E77E3A"/>

</xml_diff>